<commit_message>
Update reporting docx and agent handoffs
</commit_message>
<xml_diff>
--- a/docs/exports/bulgaria-real-estate-source-report.docx
+++ b/docs/exports/bulgaria-real-estate-source-report.docx
@@ -12,7 +12,7 @@
     </w:p>
     <w:p>
       <w:r>
-        <w:t xml:space="preserve">Generated: 2026-04-08T14:33:00.859037+00:00</w:t>
+        <w:t xml:space="preserve">Generated: 2026-04-29T03:47:34.229681+00:00</w:t>
       </w:r>
     </w:p>
     <w:p>
@@ -39,6 +39,1321 @@
     <w:p>
       <w:r>
         <w:t xml:space="preserve">Tier 1 is for first ingestion. Tier 2 is for expansion after parser gates. Tier 3 is partner/vendor/official-service first. Tier 4 is lead intelligence only and must respect consent rules.</w:t>
+      </w:r>
+    </w:p>
+    <w:p>
+      <w:pPr>
+        <w:pStyle w:val="Heading1"/>
+      </w:pPr>
+      <w:r>
+        <w:t xml:space="preserve">2026-04-28 Tier-1/2 Four-Bucket Scrape Addendum</w:t>
+      </w:r>
+    </w:p>
+    <w:p>
+      <w:r>
+        <w:t xml:space="preserve">Generated from current scrape/photo coverage and Varna four-bucket pattern manifests for the OpenClaw/Gemma4 handoff.</w:t>
+      </w:r>
+    </w:p>
+    <w:p>
+      <w:pPr>
+        <w:pStyle w:val="Heading1"/>
+      </w:pPr>
+      <w:r>
+        <w:t xml:space="preserve">Current Item And Photo Coverage</w:t>
+      </w:r>
+    </w:p>
+    <w:tbl>
+      <w:tblPr>
+        <w:tblW w:w="0" w:type="auto"/>
+        <w:tblBorders>
+          <w:top w:val="single" w:sz="4"/>
+          <w:left w:val="single" w:sz="4"/>
+          <w:bottom w:val="single" w:sz="4"/>
+          <w:right w:val="single" w:sz="4"/>
+          <w:insideH w:val="single" w:sz="4"/>
+          <w:insideV w:val="single" w:sz="4"/>
+        </w:tblBorders>
+      </w:tblPr>
+      <w:tr>
+        <w:tc>
+          <w:tcPr>
+            <w:tcW w:w="2400" w:type="dxa"/>
+          </w:tcPr>
+          <w:p>
+            <w:r>
+              <w:t xml:space="preserve">Source</w:t>
+            </w:r>
+          </w:p>
+        </w:tc>
+        <w:tc>
+          <w:tcPr>
+            <w:tcW w:w="2400" w:type="dxa"/>
+          </w:tcPr>
+          <w:p>
+            <w:r>
+              <w:t xml:space="preserve">Items</w:t>
+            </w:r>
+          </w:p>
+        </w:tc>
+        <w:tc>
+          <w:tcPr>
+            <w:tcW w:w="2400" w:type="dxa"/>
+          </w:tcPr>
+          <w:p>
+            <w:r>
+              <w:t xml:space="preserve">Descriptions</w:t>
+            </w:r>
+          </w:p>
+        </w:tc>
+        <w:tc>
+          <w:tcPr>
+            <w:tcW w:w="2400" w:type="dxa"/>
+          </w:tcPr>
+          <w:p>
+            <w:r>
+              <w:t xml:space="preserve">Remote-photo items</w:t>
+            </w:r>
+          </w:p>
+        </w:tc>
+        <w:tc>
+          <w:tcPr>
+            <w:tcW w:w="2400" w:type="dxa"/>
+          </w:tcPr>
+          <w:p>
+            <w:r>
+              <w:t xml:space="preserve">Local-photo items</w:t>
+            </w:r>
+          </w:p>
+        </w:tc>
+        <w:tc>
+          <w:tcPr>
+            <w:tcW w:w="2400" w:type="dxa"/>
+          </w:tcPr>
+          <w:p>
+            <w:r>
+              <w:t xml:space="preserve">Full galleries</w:t>
+            </w:r>
+          </w:p>
+        </w:tc>
+        <w:tc>
+          <w:tcPr>
+            <w:tcW w:w="2400" w:type="dxa"/>
+          </w:tcPr>
+          <w:p>
+            <w:r>
+              <w:t xml:space="preserve">Remote photos</w:t>
+            </w:r>
+          </w:p>
+        </w:tc>
+        <w:tc>
+          <w:tcPr>
+            <w:tcW w:w="2400" w:type="dxa"/>
+          </w:tcPr>
+          <w:p>
+            <w:r>
+              <w:t xml:space="preserve">Local photos</w:t>
+            </w:r>
+          </w:p>
+        </w:tc>
+        <w:tc>
+          <w:tcPr>
+            <w:tcW w:w="2400" w:type="dxa"/>
+          </w:tcPr>
+          <w:p>
+            <w:r>
+              <w:t xml:space="preserve">Services</w:t>
+            </w:r>
+          </w:p>
+        </w:tc>
+        <w:tc>
+          <w:tcPr>
+            <w:tcW w:w="2400" w:type="dxa"/>
+          </w:tcPr>
+          <w:p>
+            <w:r>
+              <w:t xml:space="preserve">Categories</w:t>
+            </w:r>
+          </w:p>
+        </w:tc>
+      </w:tr>
+      <w:tr>
+        <w:tc>
+          <w:tcPr>
+            <w:tcW w:w="2400" w:type="dxa"/>
+          </w:tcPr>
+          <w:p>
+            <w:r>
+              <w:t xml:space="preserve">Address.bg</w:t>
+            </w:r>
+          </w:p>
+        </w:tc>
+        <w:tc>
+          <w:tcPr>
+            <w:tcW w:w="2400" w:type="dxa"/>
+          </w:tcPr>
+          <w:p>
+            <w:r>
+              <w:t xml:space="preserve">140</w:t>
+            </w:r>
+          </w:p>
+        </w:tc>
+        <w:tc>
+          <w:tcPr>
+            <w:tcW w:w="2400" w:type="dxa"/>
+          </w:tcPr>
+          <w:p>
+            <w:r>
+              <w:t xml:space="preserve">140</w:t>
+            </w:r>
+          </w:p>
+        </w:tc>
+        <w:tc>
+          <w:tcPr>
+            <w:tcW w:w="2400" w:type="dxa"/>
+          </w:tcPr>
+          <w:p>
+            <w:r>
+              <w:t xml:space="preserve">140</w:t>
+            </w:r>
+          </w:p>
+        </w:tc>
+        <w:tc>
+          <w:tcPr>
+            <w:tcW w:w="2400" w:type="dxa"/>
+          </w:tcPr>
+          <w:p>
+            <w:r>
+              <w:t xml:space="preserve">140</w:t>
+            </w:r>
+          </w:p>
+        </w:tc>
+        <w:tc>
+          <w:tcPr>
+            <w:tcW w:w="2400" w:type="dxa"/>
+          </w:tcPr>
+          <w:p>
+            <w:r>
+              <w:t xml:space="preserve">140</w:t>
+            </w:r>
+          </w:p>
+        </w:tc>
+        <w:tc>
+          <w:tcPr>
+            <w:tcW w:w="2400" w:type="dxa"/>
+          </w:tcPr>
+          <w:p>
+            <w:r>
+              <w:t xml:space="preserve">140</w:t>
+            </w:r>
+          </w:p>
+        </w:tc>
+        <w:tc>
+          <w:tcPr>
+            <w:tcW w:w="2400" w:type="dxa"/>
+          </w:tcPr>
+          <w:p>
+            <w:r>
+              <w:t xml:space="preserve">141</w:t>
+            </w:r>
+          </w:p>
+        </w:tc>
+        <w:tc>
+          <w:tcPr>
+            <w:tcW w:w="2400" w:type="dxa"/>
+          </w:tcPr>
+          <w:p>
+            <w:r>
+              <w:t xml:space="preserve">sale:140</w:t>
+            </w:r>
+          </w:p>
+        </w:tc>
+        <w:tc>
+          <w:tcPr>
+            <w:tcW w:w="2400" w:type="dxa"/>
+          </w:tcPr>
+          <w:p>
+            <w:r>
+              <w:t xml:space="preserve">apartment:98, house:23, land:12, office:3, unknown:4</w:t>
+            </w:r>
+          </w:p>
+        </w:tc>
+      </w:tr>
+      <w:tr>
+        <w:tc>
+          <w:tcPr>
+            <w:tcW w:w="2400" w:type="dxa"/>
+          </w:tcPr>
+          <w:p>
+            <w:r>
+              <w:t xml:space="preserve">BulgarianProperties</w:t>
+            </w:r>
+          </w:p>
+        </w:tc>
+        <w:tc>
+          <w:tcPr>
+            <w:tcW w:w="2400" w:type="dxa"/>
+          </w:tcPr>
+          <w:p>
+            <w:r>
+              <w:t xml:space="preserve">249</w:t>
+            </w:r>
+          </w:p>
+        </w:tc>
+        <w:tc>
+          <w:tcPr>
+            <w:tcW w:w="2400" w:type="dxa"/>
+          </w:tcPr>
+          <w:p>
+            <w:r>
+              <w:t xml:space="preserve">249</w:t>
+            </w:r>
+          </w:p>
+        </w:tc>
+        <w:tc>
+          <w:tcPr>
+            <w:tcW w:w="2400" w:type="dxa"/>
+          </w:tcPr>
+          <w:p>
+            <w:r>
+              <w:t xml:space="preserve">249</w:t>
+            </w:r>
+          </w:p>
+        </w:tc>
+        <w:tc>
+          <w:tcPr>
+            <w:tcW w:w="2400" w:type="dxa"/>
+          </w:tcPr>
+          <w:p>
+            <w:r>
+              <w:t xml:space="preserve">249</w:t>
+            </w:r>
+          </w:p>
+        </w:tc>
+        <w:tc>
+          <w:tcPr>
+            <w:tcW w:w="2400" w:type="dxa"/>
+          </w:tcPr>
+          <w:p>
+            <w:r>
+              <w:t xml:space="preserve">1</w:t>
+            </w:r>
+          </w:p>
+        </w:tc>
+        <w:tc>
+          <w:tcPr>
+            <w:tcW w:w="2400" w:type="dxa"/>
+          </w:tcPr>
+          <w:p>
+            <w:r>
+              <w:t xml:space="preserve">8114</w:t>
+            </w:r>
+          </w:p>
+        </w:tc>
+        <w:tc>
+          <w:tcPr>
+            <w:tcW w:w="2400" w:type="dxa"/>
+          </w:tcPr>
+          <w:p>
+            <w:r>
+              <w:t xml:space="preserve">286</w:t>
+            </w:r>
+          </w:p>
+        </w:tc>
+        <w:tc>
+          <w:tcPr>
+            <w:tcW w:w="2400" w:type="dxa"/>
+          </w:tcPr>
+          <w:p>
+            <w:r>
+              <w:t xml:space="preserve">long_term_rent:12, sale:237</w:t>
+            </w:r>
+          </w:p>
+        </w:tc>
+        <w:tc>
+          <w:tcPr>
+            <w:tcW w:w="2400" w:type="dxa"/>
+          </w:tcPr>
+          <w:p>
+            <w:r>
+              <w:t xml:space="preserve">apartment:162, house:61, land:11, office:5, unknown:10</w:t>
+            </w:r>
+          </w:p>
+        </w:tc>
+      </w:tr>
+      <w:tr>
+        <w:tc>
+          <w:tcPr>
+            <w:tcW w:w="2400" w:type="dxa"/>
+          </w:tcPr>
+          <w:p>
+            <w:r>
+              <w:t xml:space="preserve">Homes.bg</w:t>
+            </w:r>
+          </w:p>
+        </w:tc>
+        <w:tc>
+          <w:tcPr>
+            <w:tcW w:w="2400" w:type="dxa"/>
+          </w:tcPr>
+          <w:p>
+            <w:r>
+              <w:t xml:space="preserve">97</w:t>
+            </w:r>
+          </w:p>
+        </w:tc>
+        <w:tc>
+          <w:tcPr>
+            <w:tcW w:w="2400" w:type="dxa"/>
+          </w:tcPr>
+          <w:p>
+            <w:r>
+              <w:t xml:space="preserve">97</w:t>
+            </w:r>
+          </w:p>
+        </w:tc>
+        <w:tc>
+          <w:tcPr>
+            <w:tcW w:w="2400" w:type="dxa"/>
+          </w:tcPr>
+          <w:p>
+            <w:r>
+              <w:t xml:space="preserve">95</w:t>
+            </w:r>
+          </w:p>
+        </w:tc>
+        <w:tc>
+          <w:tcPr>
+            <w:tcW w:w="2400" w:type="dxa"/>
+          </w:tcPr>
+          <w:p>
+            <w:r>
+              <w:t xml:space="preserve">52</w:t>
+            </w:r>
+          </w:p>
+        </w:tc>
+        <w:tc>
+          <w:tcPr>
+            <w:tcW w:w="2400" w:type="dxa"/>
+          </w:tcPr>
+          <w:p>
+            <w:r>
+              <w:t xml:space="preserve">52</w:t>
+            </w:r>
+          </w:p>
+        </w:tc>
+        <w:tc>
+          <w:tcPr>
+            <w:tcW w:w="2400" w:type="dxa"/>
+          </w:tcPr>
+          <w:p>
+            <w:r>
+              <w:t xml:space="preserve">489</w:t>
+            </w:r>
+          </w:p>
+        </w:tc>
+        <w:tc>
+          <w:tcPr>
+            <w:tcW w:w="2400" w:type="dxa"/>
+          </w:tcPr>
+          <w:p>
+            <w:r>
+              <w:t xml:space="preserve">304</w:t>
+            </w:r>
+          </w:p>
+        </w:tc>
+        <w:tc>
+          <w:tcPr>
+            <w:tcW w:w="2400" w:type="dxa"/>
+          </w:tcPr>
+          <w:p>
+            <w:r>
+              <w:t xml:space="preserve">sale:97</w:t>
+            </w:r>
+          </w:p>
+        </w:tc>
+        <w:tc>
+          <w:tcPr>
+            <w:tcW w:w="2400" w:type="dxa"/>
+          </w:tcPr>
+          <w:p>
+            <w:r>
+              <w:t xml:space="preserve">apartment:97</w:t>
+            </w:r>
+          </w:p>
+        </w:tc>
+      </w:tr>
+      <w:tr>
+        <w:tc>
+          <w:tcPr>
+            <w:tcW w:w="2400" w:type="dxa"/>
+          </w:tcPr>
+          <w:p>
+            <w:r>
+              <w:t xml:space="preserve">imot.bg</w:t>
+            </w:r>
+          </w:p>
+        </w:tc>
+        <w:tc>
+          <w:tcPr>
+            <w:tcW w:w="2400" w:type="dxa"/>
+          </w:tcPr>
+          <w:p>
+            <w:r>
+              <w:t xml:space="preserve">271</w:t>
+            </w:r>
+          </w:p>
+        </w:tc>
+        <w:tc>
+          <w:tcPr>
+            <w:tcW w:w="2400" w:type="dxa"/>
+          </w:tcPr>
+          <w:p>
+            <w:r>
+              <w:t xml:space="preserve">271</w:t>
+            </w:r>
+          </w:p>
+        </w:tc>
+        <w:tc>
+          <w:tcPr>
+            <w:tcW w:w="2400" w:type="dxa"/>
+          </w:tcPr>
+          <w:p>
+            <w:r>
+              <w:t xml:space="preserve">271</w:t>
+            </w:r>
+          </w:p>
+        </w:tc>
+        <w:tc>
+          <w:tcPr>
+            <w:tcW w:w="2400" w:type="dxa"/>
+          </w:tcPr>
+          <w:p>
+            <w:r>
+              <w:t xml:space="preserve">15</w:t>
+            </w:r>
+          </w:p>
+        </w:tc>
+        <w:tc>
+          <w:tcPr>
+            <w:tcW w:w="2400" w:type="dxa"/>
+          </w:tcPr>
+          <w:p>
+            <w:r>
+              <w:t xml:space="preserve">14</w:t>
+            </w:r>
+          </w:p>
+        </w:tc>
+        <w:tc>
+          <w:tcPr>
+            <w:tcW w:w="2400" w:type="dxa"/>
+          </w:tcPr>
+          <w:p>
+            <w:r>
+              <w:t xml:space="preserve">3191</w:t>
+            </w:r>
+          </w:p>
+        </w:tc>
+        <w:tc>
+          <w:tcPr>
+            <w:tcW w:w="2400" w:type="dxa"/>
+          </w:tcPr>
+          <w:p>
+            <w:r>
+              <w:t xml:space="preserve">148</w:t>
+            </w:r>
+          </w:p>
+        </w:tc>
+        <w:tc>
+          <w:tcPr>
+            <w:tcW w:w="2400" w:type="dxa"/>
+          </w:tcPr>
+          <w:p>
+            <w:r>
+              <w:t xml:space="preserve">sale:271</w:t>
+            </w:r>
+          </w:p>
+        </w:tc>
+        <w:tc>
+          <w:tcPr>
+            <w:tcW w:w="2400" w:type="dxa"/>
+          </w:tcPr>
+          <w:p>
+            <w:r>
+              <w:t xml:space="preserve">apartment:242, house:1, land:1, unknown:27</w:t>
+            </w:r>
+          </w:p>
+        </w:tc>
+      </w:tr>
+      <w:tr>
+        <w:tc>
+          <w:tcPr>
+            <w:tcW w:w="2400" w:type="dxa"/>
+          </w:tcPr>
+          <w:p>
+            <w:r>
+              <w:t xml:space="preserve">LUXIMMO</w:t>
+            </w:r>
+          </w:p>
+        </w:tc>
+        <w:tc>
+          <w:tcPr>
+            <w:tcW w:w="2400" w:type="dxa"/>
+          </w:tcPr>
+          <w:p>
+            <w:r>
+              <w:t xml:space="preserve">15</w:t>
+            </w:r>
+          </w:p>
+        </w:tc>
+        <w:tc>
+          <w:tcPr>
+            <w:tcW w:w="2400" w:type="dxa"/>
+          </w:tcPr>
+          <w:p>
+            <w:r>
+              <w:t xml:space="preserve">12</w:t>
+            </w:r>
+          </w:p>
+        </w:tc>
+        <w:tc>
+          <w:tcPr>
+            <w:tcW w:w="2400" w:type="dxa"/>
+          </w:tcPr>
+          <w:p>
+            <w:r>
+              <w:t xml:space="preserve">15</w:t>
+            </w:r>
+          </w:p>
+        </w:tc>
+        <w:tc>
+          <w:tcPr>
+            <w:tcW w:w="2400" w:type="dxa"/>
+          </w:tcPr>
+          <w:p>
+            <w:r>
+              <w:t xml:space="preserve">15</w:t>
+            </w:r>
+          </w:p>
+        </w:tc>
+        <w:tc>
+          <w:tcPr>
+            <w:tcW w:w="2400" w:type="dxa"/>
+          </w:tcPr>
+          <w:p>
+            <w:r>
+              <w:t xml:space="preserve">13</w:t>
+            </w:r>
+          </w:p>
+        </w:tc>
+        <w:tc>
+          <w:tcPr>
+            <w:tcW w:w="2400" w:type="dxa"/>
+          </w:tcPr>
+          <w:p>
+            <w:r>
+              <w:t xml:space="preserve">114</w:t>
+            </w:r>
+          </w:p>
+        </w:tc>
+        <w:tc>
+          <w:tcPr>
+            <w:tcW w:w="2400" w:type="dxa"/>
+          </w:tcPr>
+          <w:p>
+            <w:r>
+              <w:t xml:space="preserve">128</w:t>
+            </w:r>
+          </w:p>
+        </w:tc>
+        <w:tc>
+          <w:tcPr>
+            <w:tcW w:w="2400" w:type="dxa"/>
+          </w:tcPr>
+          <w:p>
+            <w:r>
+              <w:t xml:space="preserve">sale:15</w:t>
+            </w:r>
+          </w:p>
+        </w:tc>
+        <w:tc>
+          <w:tcPr>
+            <w:tcW w:w="2400" w:type="dxa"/>
+          </w:tcPr>
+          <w:p>
+            <w:r>
+              <w:t xml:space="preserve">apartment:15</w:t>
+            </w:r>
+          </w:p>
+        </w:tc>
+      </w:tr>
+      <w:tr>
+        <w:tc>
+          <w:tcPr>
+            <w:tcW w:w="2400" w:type="dxa"/>
+          </w:tcPr>
+          <w:p>
+            <w:r>
+              <w:t xml:space="preserve">property.bg</w:t>
+            </w:r>
+          </w:p>
+        </w:tc>
+        <w:tc>
+          <w:tcPr>
+            <w:tcW w:w="2400" w:type="dxa"/>
+          </w:tcPr>
+          <w:p>
+            <w:r>
+              <w:t xml:space="preserve">15</w:t>
+            </w:r>
+          </w:p>
+        </w:tc>
+        <w:tc>
+          <w:tcPr>
+            <w:tcW w:w="2400" w:type="dxa"/>
+          </w:tcPr>
+          <w:p>
+            <w:r>
+              <w:t xml:space="preserve">15</w:t>
+            </w:r>
+          </w:p>
+        </w:tc>
+        <w:tc>
+          <w:tcPr>
+            <w:tcW w:w="2400" w:type="dxa"/>
+          </w:tcPr>
+          <w:p>
+            <w:r>
+              <w:t xml:space="preserve">15</w:t>
+            </w:r>
+          </w:p>
+        </w:tc>
+        <w:tc>
+          <w:tcPr>
+            <w:tcW w:w="2400" w:type="dxa"/>
+          </w:tcPr>
+          <w:p>
+            <w:r>
+              <w:t xml:space="preserve">15</w:t>
+            </w:r>
+          </w:p>
+        </w:tc>
+        <w:tc>
+          <w:tcPr>
+            <w:tcW w:w="2400" w:type="dxa"/>
+          </w:tcPr>
+          <w:p>
+            <w:r>
+              <w:t xml:space="preserve">1</w:t>
+            </w:r>
+          </w:p>
+        </w:tc>
+        <w:tc>
+          <w:tcPr>
+            <w:tcW w:w="2400" w:type="dxa"/>
+          </w:tcPr>
+          <w:p>
+            <w:r>
+              <w:t xml:space="preserve">1341</w:t>
+            </w:r>
+          </w:p>
+        </w:tc>
+        <w:tc>
+          <w:tcPr>
+            <w:tcW w:w="2400" w:type="dxa"/>
+          </w:tcPr>
+          <w:p>
+            <w:r>
+              <w:t xml:space="preserve">101</w:t>
+            </w:r>
+          </w:p>
+        </w:tc>
+        <w:tc>
+          <w:tcPr>
+            <w:tcW w:w="2400" w:type="dxa"/>
+          </w:tcPr>
+          <w:p>
+            <w:r>
+              <w:t xml:space="preserve">sale:15</w:t>
+            </w:r>
+          </w:p>
+        </w:tc>
+        <w:tc>
+          <w:tcPr>
+            <w:tcW w:w="2400" w:type="dxa"/>
+          </w:tcPr>
+          <w:p>
+            <w:r>
+              <w:t xml:space="preserve">apartment:15</w:t>
+            </w:r>
+          </w:p>
+        </w:tc>
+      </w:tr>
+      <w:tr>
+        <w:tc>
+          <w:tcPr>
+            <w:tcW w:w="2400" w:type="dxa"/>
+          </w:tcPr>
+          <w:p>
+            <w:r>
+              <w:t xml:space="preserve">SUPRIMMO</w:t>
+            </w:r>
+          </w:p>
+        </w:tc>
+        <w:tc>
+          <w:tcPr>
+            <w:tcW w:w="2400" w:type="dxa"/>
+          </w:tcPr>
+          <w:p>
+            <w:r>
+              <w:t xml:space="preserve">12</w:t>
+            </w:r>
+          </w:p>
+        </w:tc>
+        <w:tc>
+          <w:tcPr>
+            <w:tcW w:w="2400" w:type="dxa"/>
+          </w:tcPr>
+          <w:p>
+            <w:r>
+              <w:t xml:space="preserve">12</w:t>
+            </w:r>
+          </w:p>
+        </w:tc>
+        <w:tc>
+          <w:tcPr>
+            <w:tcW w:w="2400" w:type="dxa"/>
+          </w:tcPr>
+          <w:p>
+            <w:r>
+              <w:t xml:space="preserve">12</w:t>
+            </w:r>
+          </w:p>
+        </w:tc>
+        <w:tc>
+          <w:tcPr>
+            <w:tcW w:w="2400" w:type="dxa"/>
+          </w:tcPr>
+          <w:p>
+            <w:r>
+              <w:t xml:space="preserve">12</w:t>
+            </w:r>
+          </w:p>
+        </w:tc>
+        <w:tc>
+          <w:tcPr>
+            <w:tcW w:w="2400" w:type="dxa"/>
+          </w:tcPr>
+          <w:p>
+            <w:r>
+              <w:t xml:space="preserve">1</w:t>
+            </w:r>
+          </w:p>
+        </w:tc>
+        <w:tc>
+          <w:tcPr>
+            <w:tcW w:w="2400" w:type="dxa"/>
+          </w:tcPr>
+          <w:p>
+            <w:r>
+              <w:t xml:space="preserve">1095</w:t>
+            </w:r>
+          </w:p>
+        </w:tc>
+        <w:tc>
+          <w:tcPr>
+            <w:tcW w:w="2400" w:type="dxa"/>
+          </w:tcPr>
+          <w:p>
+            <w:r>
+              <w:t xml:space="preserve">166</w:t>
+            </w:r>
+          </w:p>
+        </w:tc>
+        <w:tc>
+          <w:tcPr>
+            <w:tcW w:w="2400" w:type="dxa"/>
+          </w:tcPr>
+          <w:p>
+            <w:r>
+              <w:t xml:space="preserve">sale:12</w:t>
+            </w:r>
+          </w:p>
+        </w:tc>
+        <w:tc>
+          <w:tcPr>
+            <w:tcW w:w="2400" w:type="dxa"/>
+          </w:tcPr>
+          <w:p>
+            <w:r>
+              <w:t xml:space="preserve">apartment:12</w:t>
+            </w:r>
+          </w:p>
+        </w:tc>
+      </w:tr>
+    </w:tbl>
+    <w:p>
+      <w:pPr>
+        <w:pStyle w:val="Heading1"/>
+      </w:pPr>
+      <w:r>
+        <w:t xml:space="preserve">Four-Bucket Pattern Readiness</w:t>
+      </w:r>
+    </w:p>
+    <w:tbl>
+      <w:tblPr>
+        <w:tblW w:w="0" w:type="auto"/>
+        <w:tblBorders>
+          <w:top w:val="single" w:sz="4"/>
+          <w:left w:val="single" w:sz="4"/>
+          <w:bottom w:val="single" w:sz="4"/>
+          <w:right w:val="single" w:sz="4"/>
+          <w:insideH w:val="single" w:sz="4"/>
+          <w:insideV w:val="single" w:sz="4"/>
+        </w:tblBorders>
+      </w:tblPr>
+      <w:tr>
+        <w:tc>
+          <w:tcPr>
+            <w:tcW w:w="2400" w:type="dxa"/>
+          </w:tcPr>
+          <w:p>
+            <w:r>
+              <w:t xml:space="preserve">Source</w:t>
+            </w:r>
+          </w:p>
+        </w:tc>
+        <w:tc>
+          <w:tcPr>
+            <w:tcW w:w="2400" w:type="dxa"/>
+          </w:tcPr>
+          <w:p>
+            <w:r>
+              <w:t xml:space="preserve">Buy residential</w:t>
+            </w:r>
+          </w:p>
+        </w:tc>
+        <w:tc>
+          <w:tcPr>
+            <w:tcW w:w="2400" w:type="dxa"/>
+          </w:tcPr>
+          <w:p>
+            <w:r>
+              <w:t xml:space="preserve">Buy commercial</w:t>
+            </w:r>
+          </w:p>
+        </w:tc>
+        <w:tc>
+          <w:tcPr>
+            <w:tcW w:w="2400" w:type="dxa"/>
+          </w:tcPr>
+          <w:p>
+            <w:r>
+              <w:t xml:space="preserve">Rent residential</w:t>
+            </w:r>
+          </w:p>
+        </w:tc>
+        <w:tc>
+          <w:tcPr>
+            <w:tcW w:w="2400" w:type="dxa"/>
+          </w:tcPr>
+          <w:p>
+            <w:r>
+              <w:t xml:space="preserve">Rent commercial</w:t>
+            </w:r>
+          </w:p>
+        </w:tc>
+      </w:tr>
+      <w:tr>
+        <w:tc>
+          <w:tcPr>
+            <w:tcW w:w="2400" w:type="dxa"/>
+          </w:tcPr>
+          <w:p>
+            <w:r>
+              <w:t xml:space="preserve">Address.bg</w:t>
+            </w:r>
+          </w:p>
+        </w:tc>
+        <w:tc>
+          <w:tcPr>
+            <w:tcW w:w="2400" w:type="dxa"/>
+          </w:tcPr>
+          <w:p>
+            <w:r>
+              <w:t xml:space="preserve">active; detail=supported; media=supported; urls=1</w:t>
+            </w:r>
+          </w:p>
+        </w:tc>
+        <w:tc>
+          <w:tcPr>
+            <w:tcW w:w="2400" w:type="dxa"/>
+          </w:tcPr>
+          <w:p>
+            <w:r>
+              <w:t xml:space="preserve">active; detail=supported; media=supported; urls=1</w:t>
+            </w:r>
+          </w:p>
+        </w:tc>
+        <w:tc>
+          <w:tcPr>
+            <w:tcW w:w="2400" w:type="dxa"/>
+          </w:tcPr>
+          <w:p>
+            <w:r>
+              <w:t xml:space="preserve">active; detail=supported; media=supported; urls=1</w:t>
+            </w:r>
+          </w:p>
+        </w:tc>
+        <w:tc>
+          <w:tcPr>
+            <w:tcW w:w="2400" w:type="dxa"/>
+          </w:tcPr>
+          <w:p>
+            <w:r>
+              <w:t xml:space="preserve">active; detail=supported; media=supported; urls=1</w:t>
+            </w:r>
+          </w:p>
+        </w:tc>
+      </w:tr>
+      <w:tr>
+        <w:tc>
+          <w:tcPr>
+            <w:tcW w:w="2400" w:type="dxa"/>
+          </w:tcPr>
+          <w:p>
+            <w:r>
+              <w:t xml:space="preserve">BulgarianProperties</w:t>
+            </w:r>
+          </w:p>
+        </w:tc>
+        <w:tc>
+          <w:tcPr>
+            <w:tcW w:w="2400" w:type="dxa"/>
+          </w:tcPr>
+          <w:p>
+            <w:r>
+              <w:t xml:space="preserve">active; detail=supported; media=supported; urls=6</w:t>
+            </w:r>
+          </w:p>
+        </w:tc>
+        <w:tc>
+          <w:tcPr>
+            <w:tcW w:w="2400" w:type="dxa"/>
+          </w:tcPr>
+          <w:p>
+            <w:r>
+              <w:t xml:space="preserve">active; detail=supported; media=supported; urls=3</w:t>
+            </w:r>
+          </w:p>
+        </w:tc>
+        <w:tc>
+          <w:tcPr>
+            <w:tcW w:w="2400" w:type="dxa"/>
+          </w:tcPr>
+          <w:p>
+            <w:r>
+              <w:t xml:space="preserve">active; detail=supported; media=supported; urls=1</w:t>
+            </w:r>
+          </w:p>
+        </w:tc>
+        <w:tc>
+          <w:tcPr>
+            <w:tcW w:w="2400" w:type="dxa"/>
+          </w:tcPr>
+          <w:p>
+            <w:r>
+              <w:t xml:space="preserve">active; detail=supported; media=supported; urls=3</w:t>
+            </w:r>
+          </w:p>
+        </w:tc>
+      </w:tr>
+      <w:tr>
+        <w:tc>
+          <w:tcPr>
+            <w:tcW w:w="2400" w:type="dxa"/>
+          </w:tcPr>
+          <w:p>
+            <w:r>
+              <w:t xml:space="preserve">Homes.bg</w:t>
+            </w:r>
+          </w:p>
+        </w:tc>
+        <w:tc>
+          <w:tcPr>
+            <w:tcW w:w="2400" w:type="dxa"/>
+          </w:tcPr>
+          <w:p>
+            <w:r>
+              <w:t xml:space="preserve">active; detail=supported; media=supported; urls=0</w:t>
+            </w:r>
+          </w:p>
+        </w:tc>
+        <w:tc>
+          <w:tcPr>
+            <w:tcW w:w="2400" w:type="dxa"/>
+          </w:tcPr>
+          <w:p>
+            <w:r>
+              <w:t xml:space="preserve">active; detail=supported; media=supported; urls=0</w:t>
+            </w:r>
+          </w:p>
+        </w:tc>
+        <w:tc>
+          <w:tcPr>
+            <w:tcW w:w="2400" w:type="dxa"/>
+          </w:tcPr>
+          <w:p>
+            <w:r>
+              <w:t xml:space="preserve">active; detail=supported; media=supported; urls=0</w:t>
+            </w:r>
+          </w:p>
+        </w:tc>
+        <w:tc>
+          <w:tcPr>
+            <w:tcW w:w="2400" w:type="dxa"/>
+          </w:tcPr>
+          <w:p>
+            <w:r>
+              <w:t xml:space="preserve">active; detail=supported; media=supported; urls=0</w:t>
+            </w:r>
+          </w:p>
+        </w:tc>
+      </w:tr>
+      <w:tr>
+        <w:tc>
+          <w:tcPr>
+            <w:tcW w:w="2400" w:type="dxa"/>
+          </w:tcPr>
+          <w:p>
+            <w:r>
+              <w:t xml:space="preserve">imot.bg</w:t>
+            </w:r>
+          </w:p>
+        </w:tc>
+        <w:tc>
+          <w:tcPr>
+            <w:tcW w:w="2400" w:type="dxa"/>
+          </w:tcPr>
+          <w:p>
+            <w:r>
+              <w:t xml:space="preserve">active; detail=supported; media=supported; urls=1</w:t>
+            </w:r>
+          </w:p>
+        </w:tc>
+        <w:tc>
+          <w:tcPr>
+            <w:tcW w:w="2400" w:type="dxa"/>
+          </w:tcPr>
+          <w:p>
+            <w:r>
+              <w:t xml:space="preserve">active; detail=supported; media=supported; urls=1</w:t>
+            </w:r>
+          </w:p>
+        </w:tc>
+        <w:tc>
+          <w:tcPr>
+            <w:tcW w:w="2400" w:type="dxa"/>
+          </w:tcPr>
+          <w:p>
+            <w:r>
+              <w:t xml:space="preserve">active; detail=supported; media=supported; urls=1</w:t>
+            </w:r>
+          </w:p>
+        </w:tc>
+        <w:tc>
+          <w:tcPr>
+            <w:tcW w:w="2400" w:type="dxa"/>
+          </w:tcPr>
+          <w:p>
+            <w:r>
+              <w:t xml:space="preserve">active; detail=supported; media=supported; urls=1</w:t>
+            </w:r>
+          </w:p>
+        </w:tc>
+      </w:tr>
+      <w:tr>
+        <w:tc>
+          <w:tcPr>
+            <w:tcW w:w="2400" w:type="dxa"/>
+          </w:tcPr>
+          <w:p>
+            <w:r>
+              <w:t xml:space="preserve">LUXIMMO</w:t>
+            </w:r>
+          </w:p>
+        </w:tc>
+        <w:tc>
+          <w:tcPr>
+            <w:tcW w:w="2400" w:type="dxa"/>
+          </w:tcPr>
+          <w:p>
+            <w:r>
+              <w:t xml:space="preserve">active; detail=supported; media=supported; urls=1</w:t>
+            </w:r>
+          </w:p>
+        </w:tc>
+        <w:tc>
+          <w:tcPr>
+            <w:tcW w:w="2400" w:type="dxa"/>
+          </w:tcPr>
+          <w:p>
+            <w:r>
+              <w:t xml:space="preserve">active; detail=supported; media=supported; urls=2</w:t>
+            </w:r>
+          </w:p>
+        </w:tc>
+        <w:tc>
+          <w:tcPr>
+            <w:tcW w:w="2400" w:type="dxa"/>
+          </w:tcPr>
+          <w:p>
+            <w:r>
+              <w:t xml:space="preserve">active; detail=supported; media=supported; urls=1</w:t>
+            </w:r>
+          </w:p>
+        </w:tc>
+        <w:tc>
+          <w:tcPr>
+            <w:tcW w:w="2400" w:type="dxa"/>
+          </w:tcPr>
+          <w:p>
+            <w:r>
+              <w:t xml:space="preserve">active; detail=supported; media=supported; urls=2</w:t>
+            </w:r>
+          </w:p>
+        </w:tc>
+      </w:tr>
+      <w:tr>
+        <w:tc>
+          <w:tcPr>
+            <w:tcW w:w="2400" w:type="dxa"/>
+          </w:tcPr>
+          <w:p>
+            <w:r>
+              <w:t xml:space="preserve">property.bg</w:t>
+            </w:r>
+          </w:p>
+        </w:tc>
+        <w:tc>
+          <w:tcPr>
+            <w:tcW w:w="2400" w:type="dxa"/>
+          </w:tcPr>
+          <w:p>
+            <w:r>
+              <w:t xml:space="preserve">active; detail=supported; media=supported; urls=2</w:t>
+            </w:r>
+          </w:p>
+        </w:tc>
+        <w:tc>
+          <w:tcPr>
+            <w:tcW w:w="2400" w:type="dxa"/>
+          </w:tcPr>
+          <w:p>
+            <w:r>
+              <w:t xml:space="preserve">active; detail=supported; media=supported; urls=2</w:t>
+            </w:r>
+          </w:p>
+        </w:tc>
+        <w:tc>
+          <w:tcPr>
+            <w:tcW w:w="2400" w:type="dxa"/>
+          </w:tcPr>
+          <w:p>
+            <w:r>
+              <w:t xml:space="preserve">active; detail=supported; media=supported; urls=1</w:t>
+            </w:r>
+          </w:p>
+        </w:tc>
+        <w:tc>
+          <w:tcPr>
+            <w:tcW w:w="2400" w:type="dxa"/>
+          </w:tcPr>
+          <w:p>
+            <w:r>
+              <w:t xml:space="preserve">active; detail=supported; media=supported; urls=2</w:t>
+            </w:r>
+          </w:p>
+        </w:tc>
+      </w:tr>
+      <w:tr>
+        <w:tc>
+          <w:tcPr>
+            <w:tcW w:w="2400" w:type="dxa"/>
+          </w:tcPr>
+          <w:p>
+            <w:r>
+              <w:t xml:space="preserve">SUPRIMMO</w:t>
+            </w:r>
+          </w:p>
+        </w:tc>
+        <w:tc>
+          <w:tcPr>
+            <w:tcW w:w="2400" w:type="dxa"/>
+          </w:tcPr>
+          <w:p>
+            <w:r>
+              <w:t xml:space="preserve">active; detail=supported; media=supported; urls=3</w:t>
+            </w:r>
+          </w:p>
+        </w:tc>
+        <w:tc>
+          <w:tcPr>
+            <w:tcW w:w="2400" w:type="dxa"/>
+          </w:tcPr>
+          <w:p>
+            <w:r>
+              <w:t xml:space="preserve">active; detail=supported; media=supported; urls=2</w:t>
+            </w:r>
+          </w:p>
+        </w:tc>
+        <w:tc>
+          <w:tcPr>
+            <w:tcW w:w="2400" w:type="dxa"/>
+          </w:tcPr>
+          <w:p>
+            <w:r>
+              <w:t xml:space="preserve">active; detail=supported; media=supported; urls=1</w:t>
+            </w:r>
+          </w:p>
+        </w:tc>
+        <w:tc>
+          <w:tcPr>
+            <w:tcW w:w="2400" w:type="dxa"/>
+          </w:tcPr>
+          <w:p>
+            <w:r>
+              <w:t xml:space="preserve">active; detail=supported; media=supported; urls=2</w:t>
+            </w:r>
+          </w:p>
+        </w:tc>
+      </w:tr>
+    </w:tbl>
+    <w:p>
+      <w:pPr>
+        <w:pStyle w:val="Heading1"/>
+      </w:pPr>
+      <w:r>
+        <w:t xml:space="preserve">Agent Handoff Rules</w:t>
+      </w:r>
+    </w:p>
+    <w:p>
+      <w:r>
+        <w:t xml:space="preserve">1. Gemma4/OpenClaw must consume only local files listed in local_image_files.</w:t>
+      </w:r>
+    </w:p>
+    <w:p>
+      <w:r>
+        <w:t xml:space="preserve">2. Each property report must combine scraped page description, structured fields, source links, and ordered image descriptions.</w:t>
+      </w:r>
+    </w:p>
+    <w:p>
+      <w:r>
+        <w:t xml:space="preserve">3. Photo counts, price, size, city/address, and category must be checked before marking a listing complete.</w:t>
+      </w:r>
+    </w:p>
+    <w:p>
+      <w:r>
+        <w:t xml:space="preserve">4. Live scraping remains operator-approved and must respect legal_mode, risk_mode, and access_mode from data/source_registry.json.</w:t>
       </w:r>
     </w:p>
     <w:p>

</xml_diff>

<commit_message>
Update S1-21 Gemma scrape handoff
</commit_message>
<xml_diff>
--- a/docs/exports/bulgaria-real-estate-source-report.docx
+++ b/docs/exports/bulgaria-real-estate-source-report.docx
@@ -12,7 +12,7 @@
     </w:p>
     <w:p>
       <w:r>
-        <w:t xml:space="preserve">Generated: 2026-04-29T03:47:34.229681+00:00</w:t>
+        <w:t xml:space="preserve">Generated: 2026-04-29T08:12:29.239059+00:00</w:t>
       </w:r>
     </w:p>
     <w:p>
@@ -46,12 +46,12 @@
         <w:pStyle w:val="Heading1"/>
       </w:pPr>
       <w:r>
-        <w:t xml:space="preserve">2026-04-28 Tier-1/2 Four-Bucket Scrape Addendum</w:t>
+        <w:t xml:space="preserve">2026-04-29 Tier-1/2 Four-Bucket Scrape Addendum</w:t>
       </w:r>
     </w:p>
     <w:p>
       <w:r>
-        <w:t xml:space="preserve">Generated from current scrape/photo coverage and Varna four-bucket pattern manifests for the OpenClaw/Gemma4 handoff.</w:t>
+        <w:t xml:space="preserve">Generated from current scrape/photo coverage, S1-21 quality audit outputs, and four-bucket pattern manifests for the OpenClaw/Gemma4 handoff.</w:t>
       </w:r>
     </w:p>
     <w:p>
@@ -1338,22 +1338,32 @@
     </w:p>
     <w:p>
       <w:r>
-        <w:t xml:space="preserve">1. Gemma4/OpenClaw must consume only local files listed in local_image_files.</w:t>
+        <w:t xml:space="preserve">1. Action0 runs first from docs/exports/s1-21-gemma-action0-eligible.json and consumes only local files listed in local_image_files.</w:t>
       </w:r>
     </w:p>
     <w:p>
       <w:r>
-        <w:t xml:space="preserve">2. Each property report must combine scraped page description, structured fields, source links, and ordered image descriptions.</w:t>
+        <w:t xml:space="preserve">2. Each property report must combine scraped page description, structured fields, source links, ordered image descriptions, and one whole-property visual summary.</w:t>
       </w:r>
     </w:p>
     <w:p>
       <w:r>
-        <w:t xml:space="preserve">3. Photo counts, price, size, city/address, and category must be checked before marking a listing complete.</w:t>
+        <w:t xml:space="preserve">3. Photo counts, local file validity, price, size, city/address, category, and same-location status must be checked before marking a listing complete.</w:t>
       </w:r>
     </w:p>
     <w:p>
       <w:r>
-        <w:t xml:space="preserve">4. Live scraping remains operator-approved and must respect legal_mode, risk_mode, and access_mode from data/source_registry.json.</w:t>
+        <w:t xml:space="preserve">4. Action1 runs second for the seven priority sources across all four buckets under operator-approved live runtime.</w:t>
+      </w:r>
+    </w:p>
+    <w:p>
+      <w:r>
+        <w:t xml:space="preserve">5. Action2 runs third for remaining legal tier-1/2 sources after Action1 QA.</w:t>
+      </w:r>
+    </w:p>
+    <w:p>
+      <w:r>
+        <w:t xml:space="preserve">6. Live scraping remains operator-approved and must respect legal_mode, risk_mode, and access_mode from data/source_registry.json.</w:t>
       </w:r>
     </w:p>
     <w:p>

</xml_diff>